<commit_message>
Letter: sign off as Jake McAllister, not Steve Lindsay
The resident / business letter template now signs off as the actual
designer of these schemes. Replaces inside the DOCX:
 - Embedded body signature image (was Steve's, now templates/signature.png
   converted to JPEG; cx in the drawing extent updated to keep the height
   constant under the new aspect ratio).
 - "Mr Lindsay"               -> "Mr McAllister"
 - "Steve Lindsay"             -> "Jake McAllister"
 - "07557 184359"              -> "07741 618901"
 - "steve.lindsay01@..."       -> "jake.mcallister@..."

Mail-merge generation is unchanged — the template's static signatory
fields update for every recipient automatically.
</commit_message>
<xml_diff>
--- a/templates/Residential_Letter_Template (1).docx
+++ b/templates/Residential_Letter_Template (1).docx
@@ -198,11 +198,11 @@
                 <w:sz w:val="16"/>
                 <w:szCs w:val="16"/>
               </w:rPr>
-              <w:t>Mr Lindsay</w:t>
+              <w:t>Mr McAllister</w:t>
               <w:fldChar w:fldCharType="begin"/>
               <w:instrText xml:space="preserve"/>
               <w:fldChar w:fldCharType="end"/>
-              <w:t>, 07557 184359</w:t>
+              <w:t>, 07741 618901</w:t>
             </w:r>
           </w:p>
         </w:tc>
@@ -449,7 +449,7 @@
                 <w:sz w:val="16"/>
                 <w:szCs w:val="16"/>
               </w:rPr>
-              <w:t xml:space="preserve">Email:  steve.lindsay01@dundeecity.gov.uk </w:t>
+              <w:t xml:space="preserve">Email:  jake.mcallister@dundeecity.gov.uk </w:t>
             </w:r>
           </w:p>
           <w:p>
@@ -788,7 +788,7 @@
         </w:rPr>
         <w:drawing>
           <wp:inline distT="0" distB="0" distL="0" distR="0" wp14:anchorId="35024C65" wp14:editId="24F2C09C">
-            <wp:extent cx="2038350" cy="574183"/>
+            <wp:extent cx="2372130" cy="574183"/>
             <wp:effectExtent l="0" t="0" r="0" b="0"/>
             <wp:docPr id="501220122" name="Picture 2" descr="A black and white image of a person's face  Description automatically generated"/>
             <wp:cNvGraphicFramePr>
@@ -816,7 +816,7 @@
                   <pic:spPr>
                     <a:xfrm>
                       <a:off x="0" y="0"/>
-                      <a:ext cx="2051680" cy="577938"/>
+                      <a:ext cx="2387643" cy="577938"/>
                     </a:xfrm>
                     <a:prstGeom prst="rect">
                       <a:avLst/>
@@ -841,7 +841,7 @@
           <w:sz w:val="20"/>
           <w:szCs w:val="20"/>
         </w:rPr>
-        <w:t>Steve Lindsay</w:t>
+        <w:t>Jake McAllister</w:t>
       </w:r>
     </w:p>
     <w:p>

</xml_diff>

<commit_message>
Letter: tighten paragraph spacing so it stays on one page
Resident / business letters were spilling onto a second page once the
body had three paragraphs (intro + closure + apology). Two changes:

- Halve before/after spacing (120 → 60 twentieths-of-a-pt = 6pt → 3pt)
  on every body-style paragraph in the DOCX template — applies to the
  body, the inter-section spacer, and "Yours faithfully".
- bodyToXml in LetterPreview now emits proper <w:pPr>/<w:rPr> on the
  paragraphs it inserts for each \\n\\n. Previously those bare <w:p>
  tags fell back to Word's ~10pt default after-spacing, which dwarfed
  the template's compact spacing and was the main culprit.

Net effect on a 3-paragraph mail-merged letter: roughly 18mm of vertical
space reclaimed — comfortably back on a single page.
</commit_message>
<xml_diff>
--- a/templates/Residential_Letter_Template (1).docx
+++ b/templates/Residential_Letter_Template (1).docx
@@ -678,7 +678,7 @@
     </w:tbl>
     <w:p>
       <w:pPr>
-        <w:spacing w:before="120" w:after="120"/>
+        <w:spacing w:before="60" w:after="60"/>
         <w:jc w:val="both"/>
         <w:rPr>
           <w:color w:val="000000"/>
@@ -697,7 +697,7 @@
     </w:p>
     <w:p>
       <w:pPr>
-        <w:spacing w:before="120" w:after="120"/>
+        <w:spacing w:before="60" w:after="60"/>
         <w:jc w:val="both"/>
         <w:rPr>
           <w:color w:val="000000"/>
@@ -708,7 +708,7 @@
     </w:p>
     <w:p>
       <w:pPr>
-        <w:spacing w:before="120" w:after="120"/>
+        <w:spacing w:before="60" w:after="60"/>
         <w:jc w:val="both"/>
         <w:rPr>
           <w:color w:val="000000"/>
@@ -727,7 +727,7 @@
     </w:p>
     <w:p>
       <w:pPr>
-        <w:spacing w:before="120" w:after="120"/>
+        <w:spacing w:before="60" w:after="60"/>
         <w:jc w:val="both"/>
         <w:rPr>
           <w:color w:val="000000"/>
@@ -738,7 +738,7 @@
     </w:p>
     <w:p>
       <w:pPr>
-        <w:spacing w:before="120" w:after="120"/>
+        <w:spacing w:before="60" w:after="60"/>
         <w:jc w:val="both"/>
         <w:rPr>
           <w:color w:val="000000"/>
@@ -757,7 +757,7 @@
     </w:p>
     <w:p>
       <w:pPr>
-        <w:spacing w:before="120" w:after="120"/>
+        <w:spacing w:before="60" w:after="60"/>
         <w:jc w:val="both"/>
         <w:rPr>
           <w:color w:val="000000"/>
@@ -768,7 +768,7 @@
     </w:p>
     <w:p>
       <w:pPr>
-        <w:spacing w:before="120" w:after="120"/>
+        <w:spacing w:before="60" w:after="60"/>
         <w:jc w:val="both"/>
         <w:rPr>
           <w:noProof/>

</xml_diff>